<commit_message>
feat: end CV bullet points with a period
</commit_message>
<xml_diff>
--- a/public/cv/english/CV-minimal.docx
+++ b/public/cv/english/CV-minimal.docx
@@ -196,7 +196,7 @@
         <w:rPr>
           <w:lang w:val="en"/>
         </w:rPr>
-        <w:t xml:space="preserve">Designed PostgreSQL schema for IT inventory, stock and asset assignment</w:t>
+        <w:t xml:space="preserve">Designed PostgreSQL schema for IT inventory, stock and asset assignment.</w:t>
       </w:r>
     </w:p>
     <w:p>
@@ -211,7 +211,7 @@
         <w:rPr>
           <w:lang w:val="en"/>
         </w:rPr>
-        <w:t xml:space="preserve">Built React + TypeScript CRM prototype from business requirements</w:t>
+        <w:t xml:space="preserve">Built React + TypeScript CRM prototype from business requirements.</w:t>
       </w:r>
     </w:p>
     <w:p>
@@ -226,7 +226,7 @@
         <w:rPr>
           <w:lang w:val="en"/>
         </w:rPr>
-        <w:t xml:space="preserve">Joined SAP, Jira and Qlik workflows; proposed MASSGuard AI concept</w:t>
+        <w:t xml:space="preserve">Joined SAP, Jira and Qlik workflows; proposed MASSGuard AI concept.</w:t>
       </w:r>
     </w:p>
     <w:p>
@@ -258,7 +258,7 @@
         <w:rPr>
           <w:lang w:val="en"/>
         </w:rPr>
-        <w:t xml:space="preserve">Built SQL Server backup platform: multi-tenant ASP.NET Core API, Quartz.NET, PostgreSQL, agent, React UI</w:t>
+        <w:t xml:space="preserve">Built SQL Server backup platform: multi-tenant ASP.NET Core API, Quartz.NET, PostgreSQL, agent, React UI.</w:t>
       </w:r>
     </w:p>
     <w:p>
@@ -273,7 +273,7 @@
         <w:rPr>
           <w:lang w:val="en"/>
         </w:rPr>
-        <w:t xml:space="preserve">Built offline-first IMAP/SMTP mail client: .NET 10 + PostgreSQL backend, Flutter app</w:t>
+        <w:t xml:space="preserve">Built offline-first IMAP/SMTP mail client: .NET 10 + PostgreSQL backend, Flutter app.</w:t>
       </w:r>
     </w:p>
     <w:p>
@@ -288,7 +288,7 @@
         <w:rPr>
           <w:lang w:val="en"/>
         </w:rPr>
-        <w:t xml:space="preserve">Small contribution to company reconciliation web app (backend fixes, accessible UI)</w:t>
+        <w:t xml:space="preserve">Small contribution to company reconciliation web app (backend fixes, accessible UI).</w:t>
       </w:r>
     </w:p>
     <w:p>
@@ -303,7 +303,7 @@
         <w:rPr>
           <w:lang w:val="en"/>
         </w:rPr>
-        <w:t xml:space="preserve">References available on request</w:t>
+        <w:t xml:space="preserve">References available on request.</w:t>
       </w:r>
     </w:p>
     <w:p>
@@ -335,7 +335,7 @@
         <w:rPr>
           <w:lang w:val="en"/>
         </w:rPr>
-        <w:t xml:space="preserve">Built Python CLI app with JSON storage</w:t>
+        <w:t xml:space="preserve">Built Python CLI app with JSON storage.</w:t>
       </w:r>
     </w:p>
     <w:p>
@@ -350,7 +350,7 @@
         <w:rPr>
           <w:lang w:val="en"/>
         </w:rPr>
-        <w:t xml:space="preserve">Delivered Excel dashboard, AutoCAD drawing and Blender 3D room</w:t>
+        <w:t xml:space="preserve">Delivered Excel dashboard, AutoCAD drawing and Blender 3D room.</w:t>
       </w:r>
     </w:p>
     <w:bookmarkEnd w:id="14"/>
@@ -474,7 +474,7 @@
         <w:rPr>
           <w:lang w:val="en"/>
         </w:rPr>
-        <w:t xml:space="preserve">Data structures, algorithms, databases, operating systems</w:t>
+        <w:t xml:space="preserve">Data structures, algorithms, databases, operating systems.</w:t>
       </w:r>
     </w:p>
     <w:p>
@@ -489,7 +489,7 @@
         <w:rPr>
           <w:lang w:val="en"/>
         </w:rPr>
-        <w:t xml:space="preserve">Software engineering, web technologies, computer networks</w:t>
+        <w:t xml:space="preserve">Software engineering, web technologies, computer networks.</w:t>
       </w:r>
     </w:p>
     <w:p>
@@ -504,7 +504,7 @@
         <w:rPr>
           <w:lang w:val="en"/>
         </w:rPr>
-        <w:t xml:space="preserve">Machine learning, AI, computer graphics, cloud computing</w:t>
+        <w:t xml:space="preserve">Machine learning, AI, computer graphics, cloud computing.</w:t>
       </w:r>
     </w:p>
     <w:p>
@@ -536,7 +536,7 @@
         <w:rPr>
           <w:lang w:val="en"/>
         </w:rPr>
-        <w:t xml:space="preserve">Erasmus exchange, OOP with C++</w:t>
+        <w:t xml:space="preserve">Erasmus exchange, OOP with C++.</w:t>
       </w:r>
     </w:p>
     <w:p>
@@ -551,7 +551,7 @@
         <w:rPr>
           <w:lang w:val="en"/>
         </w:rPr>
-        <w:t xml:space="preserve">3D animation and graphics with Blender</w:t>
+        <w:t xml:space="preserve">3D animation and graphics with Blender.</w:t>
       </w:r>
     </w:p>
     <w:bookmarkEnd w:id="16"/>

</xml_diff>

<commit_message>
feat: describe ADM database and CRM case study in detail, add references line
</commit_message>
<xml_diff>
--- a/public/cv/english/CV-minimal.docx
+++ b/public/cv/english/CV-minimal.docx
@@ -196,7 +196,7 @@
         <w:rPr>
           <w:lang w:val="en"/>
         </w:rPr>
-        <w:t xml:space="preserve">Designed PostgreSQL schema for IT inventory, stock and asset assignment.</w:t>
+        <w:t xml:space="preserve">Built a complete PostgreSQL database for IT inventory and stock.</w:t>
       </w:r>
     </w:p>
     <w:p>
@@ -211,7 +211,7 @@
         <w:rPr>
           <w:lang w:val="en"/>
         </w:rPr>
-        <w:t xml:space="preserve">Built React + TypeScript CRM prototype from business requirements.</w:t>
+        <w:t xml:space="preserve">Completed customer request case study: scope, requirements, wireframes, React prototype.</w:t>
       </w:r>
     </w:p>
     <w:p>
@@ -227,6 +227,21 @@
           <w:lang w:val="en"/>
         </w:rPr>
         <w:t xml:space="preserve">Joined SAP, Jira and Qlik workflows; proposed MASSGuard AI concept.</w:t>
+      </w:r>
+    </w:p>
+    <w:p>
+      <w:pPr>
+        <w:pStyle w:val="Compact"/>
+        <w:numPr>
+          <w:ilvl w:val="0"/>
+          <w:numId w:val="1001"/>
+        </w:numPr>
+      </w:pPr>
+      <w:r>
+        <w:rPr>
+          <w:lang w:val="en"/>
+        </w:rPr>
+        <w:t xml:space="preserve">References available on request.</w:t>
       </w:r>
     </w:p>
     <w:p>

</xml_diff>